<commit_message>
docs(guide): say dots and plus signs in phone numbers do not matter
The Payments column table and the Quick Reminders line now list the
same characters the match key strips, as the Pledges section already
did.

Co-Authored-By: Claude Opus 5.5 (1M context) <noreply@anthropic.com>
</commit_message>
<xml_diff>
--- a/Fundraiser_Tracker_User_Guide.docx
+++ b/Fundraiser_Tracker_User_Guide.docx
@@ -889,7 +889,7 @@
               <w:rPr>
                 <w:sz w:val="20"/>
               </w:rPr>
-              <w:t>The same digits used for this donor on the Pledges tab. Dashes, spaces and brackets do not need to match.</w:t>
+              <w:t>The same digits used for this donor on the Pledges tab. Dashes, spaces, brackets, dots and plus signs do not need to match.</w:t>
             </w:r>
           </w:p>
         </w:tc>
@@ -1848,7 +1848,7 @@
         <w:rPr>
           <w:sz w:val="22"/>
         </w:rPr>
-        <w:t>Use the same phone digits for the same donor on both tabs. Dashes and spaces do not matter.</w:t>
+        <w:t>Use the same phone digits for the same donor on both tabs. Dashes, spaces, brackets, dots and plus signs do not matter.</w:t>
       </w:r>
     </w:p>
     <w:p>

</xml_diff>